<commit_message>
Ch28: Camilla said it once (matches Ch15's 'Your finger' / 'It goes there')
Co-Authored-By: Claude Opus 5.5 <noreply@anthropic.com>
</commit_message>
<xml_diff>
--- a/claude-notes/manuscript-v2/28-feeds-merged.docx
+++ b/claude-notes/manuscript-v2/28-feeds-merged.docx
@@ -244,7 +244,23 @@
           <w:i w:val="0"/>
           <w:strike w:val="0"/>
         </w:rPr>
-        <w:t>She had built it so that nobody would stand there. She'd built it with her teeth set and the egg yolk dried in her knuckles, and every night of the nineteen she'd watched his finger walk down the clay to the split splinter and stop, and she'd never said so. She'd known since the briefing room. She'd known on the stairs, when he'd crouched for Otto. It didn't help. Her metal hand had taken hold of the back of Ben's stool, and the frame gave a small dry creak under it before she made the fingers let go.</w:t>
+        <w:t xml:space="preserve">She had built it so that nobody would stand there. She'd built it with her teeth set and the egg yolk dried in her knuckles, and every night of the nineteen she'd watched his finger walk down the clay to the split splinter and stop. She'd said so once. </w:t>
+      </w:r>
+      <w:r>
+        <w:rPr>
+          <w:b w:val="0"/>
+          <w:i/>
+          <w:strike w:val="0"/>
+        </w:rPr>
+        <w:t>It goes there,</w:t>
+      </w:r>
+      <w:r>
+        <w:rPr>
+          <w:b w:val="0"/>
+          <w:i w:val="0"/>
+          <w:strike w:val="0"/>
+        </w:rPr>
+        <w:t xml:space="preserve"> he'd told her, and swept the splinters into the box. She'd known since the briefing room. She'd known on the stairs, when he'd crouched for Otto. It didn't help. Her metal hand had taken hold of the back of Ben's stool, and the frame gave a small dry creak under it before she made the fingers let go.</w:t>
       </w:r>
     </w:p>
     <w:p>

</xml_diff>

<commit_message>
Ch28 round 2: Camilla's reason to leave; Landed/Again protocol and count; Daren seen; trims
Co-Authored-By: Claude Opus 5.5 <noreply@anthropic.com>
</commit_message>
<xml_diff>
--- a/claude-notes/manuscript-v2/28-feeds-merged.docx
+++ b/claude-notes/manuscript-v2/28-feeds-merged.docx
@@ -183,7 +183,7 @@
           <w:i w:val="0"/>
           <w:strike w:val="0"/>
         </w:rPr>
-        <w:t>The Hub, wide and grey and lit by its own work lamps, with no one under them. The turbine floor. The long mouth of the drainage run. And at the far edge, squat against the rock, the old pump house that drew Miner Town's ration water up out of the deep, with one caged lamp over its door and its pumps going round alone, as they did every night after the second bell. Nobody kept it at night. She'd checked it every night. She checked it again now, every corner of the grey picture, and the door stayed shut and the lamp stayed lit and nothing moved in front of it but water in the gutter.</w:t>
+        <w:t>The Hub, wide and grey and lit by its own work lamps, with no one under them. The turbine floor. The long mouth of the drainage run. And at the far edge, squat against the rock, the old pump house that drew Miner Town's ration water up out of the deep, with one caged lamp over its door and its pumps going round alone, as they did every night after the second bell. Nobody kept it at night. She'd checked it every night for a man inside. She had never once thought about what it drew. She checked it again now, every corner of the grey picture, and the door stayed shut and the lamp stayed lit and nothing moved in front of it but water in the gutter.</w:t>
       </w:r>
     </w:p>
     <w:p>
@@ -340,6 +340,16 @@
           <w:i w:val="0"/>
           <w:strike w:val="0"/>
         </w:rPr>
+        <w:t>She counted with him. At thirty-one he stopped.</w:t>
+      </w:r>
+    </w:p>
+    <w:p>
+      <w:r>
+        <w:rPr>
+          <w:b w:val="0"/>
+          <w:i w:val="0"/>
+          <w:strike w:val="0"/>
+        </w:rPr>
         <w:t>The engineer turned the glass over. The rust-colored sand began to fall.</w:t>
       </w:r>
     </w:p>
@@ -400,17 +410,17 @@
           <w:i w:val="0"/>
           <w:strike w:val="0"/>
         </w:rPr>
-        <w:t>"Landed," Gage said. A pause the length of a step. "Again."</w:t>
-      </w:r>
-    </w:p>
-    <w:p>
-      <w:r>
-        <w:rPr>
-          <w:b w:val="0"/>
-          <w:i w:val="0"/>
-          <w:strike w:val="0"/>
-        </w:rPr>
-        <w:t>"Again."</w:t>
+        <w:t>"Landed," Gage said.</w:t>
+      </w:r>
+    </w:p>
+    <w:p>
+      <w:r>
+        <w:rPr>
+          <w:b w:val="0"/>
+          <w:i w:val="0"/>
+          <w:strike w:val="0"/>
+        </w:rPr>
+        <w:t>A pause the length of a step. "Again," Camilla said.</w:t>
       </w:r>
     </w:p>
     <w:p>
@@ -466,7 +476,17 @@
           <w:i w:val="0"/>
           <w:strike w:val="0"/>
         </w:rPr>
-        <w:t>"Landed. Again."</w:t>
+        <w:t>"Landed," Gage said.</w:t>
+      </w:r>
+    </w:p>
+    <w:p>
+      <w:r>
+        <w:rPr>
+          <w:b w:val="0"/>
+          <w:i w:val="0"/>
+          <w:strike w:val="0"/>
+        </w:rPr>
+        <w:t>"Again," Camilla said.</w:t>
       </w:r>
     </w:p>
     <w:p>
@@ -580,17 +600,27 @@
           <w:i w:val="0"/>
           <w:strike w:val="0"/>
         </w:rPr>
-        <w:t>"Landed," Gage said in her ear. "Again."</w:t>
-      </w:r>
-    </w:p>
-    <w:p>
-      <w:r>
-        <w:rPr>
-          <w:b w:val="0"/>
-          <w:i w:val="0"/>
-          <w:strike w:val="0"/>
-        </w:rPr>
-        <w:t>"Again," she said.</w:t>
+        <w:t>"Landed," Gage said in her ear.</w:t>
+      </w:r>
+    </w:p>
+    <w:p>
+      <w:r>
+        <w:rPr>
+          <w:b w:val="0"/>
+          <w:i w:val="0"/>
+          <w:strike w:val="0"/>
+        </w:rPr>
+        <w:t>On the screen below the table room, a corridor outside it. Otto had been standing in that corridor since before the shift change, where he'd said he'd be, with his back to the wall and his hands loose at his sides, so still that twice she'd thought the screen had frozen. His head was still turned along the curve. Nothing in the corridor had made a sound; the ring's ears logged nothing. He kept looking toward the old route anyway, and then he opened the table-room door beside him and went in, unhurried, setting his feet down as he did on soft ground.</w:t>
+      </w:r>
+    </w:p>
+    <w:p>
+      <w:r>
+        <w:rPr>
+          <w:b w:val="0"/>
+          <w:i w:val="0"/>
+          <w:strike w:val="0"/>
+        </w:rPr>
+        <w:t>"Again," she said, and watched Otto's door swing shut.</w:t>
       </w:r>
     </w:p>
     <w:p>
@@ -610,27 +640,7 @@
           <w:i w:val="0"/>
           <w:strike w:val="0"/>
         </w:rPr>
-        <w:t>On the screen below the table room, a corridor outside it. Otto had been standing in that corridor since before the shift change, where he'd said he'd be, with his back to the wall and his hands loose at his sides, so still that twice she'd thought the screen had frozen. His head was still turned along the curve. Nothing in the corridor had made a sound; the ring's ears logged nothing. He kept looking toward the old route anyway, and then he opened the table-room door beside him and went in, unhurried, setting his feet down as he did on soft ground.</w:t>
-      </w:r>
-    </w:p>
-    <w:p>
-      <w:r>
-        <w:rPr>
-          <w:b w:val="0"/>
-          <w:i w:val="0"/>
-          <w:strike w:val="0"/>
-        </w:rPr>
-        <w:t>Two screens. One voice.</w:t>
-      </w:r>
-    </w:p>
-    <w:p>
-      <w:r>
-        <w:rPr>
-          <w:b w:val="0"/>
-          <w:i w:val="0"/>
-          <w:strike w:val="0"/>
-        </w:rPr>
-        <w:t>She had one word in her mouth, and it belonged to the wall.</w:t>
+        <w:t>"Five," Ben said.</w:t>
       </w:r>
     </w:p>
     <w:p>
@@ -680,6 +690,16 @@
           <w:i w:val="0"/>
           <w:strike w:val="0"/>
         </w:rPr>
+        <w:t>The engineer looked at her, and at the sand, and went back to the sand.</w:t>
+      </w:r>
+    </w:p>
+    <w:p>
+      <w:r>
+        <w:rPr>
+          <w:b w:val="0"/>
+          <w:i w:val="0"/>
+          <w:strike w:val="0"/>
+        </w:rPr>
         <w:t>"Who are you?"</w:t>
       </w:r>
     </w:p>
@@ -700,17 +720,17 @@
           <w:i w:val="0"/>
           <w:strike w:val="0"/>
         </w:rPr>
-        <w:t>"Landed," said Gage, small and far away. "Again."</w:t>
-      </w:r>
-    </w:p>
-    <w:p>
-      <w:r>
-        <w:rPr>
-          <w:b w:val="0"/>
-          <w:i w:val="0"/>
-          <w:strike w:val="0"/>
-        </w:rPr>
-        <w:t>"Again," Camilla said, and the headset man said "Closed," and the wall answered, and she didn't take her eyes off the stranger. "Five," Ben said.</w:t>
+        <w:t>"Landed," said Gage, small and far away.</w:t>
+      </w:r>
+    </w:p>
+    <w:p>
+      <w:r>
+        <w:rPr>
+          <w:b w:val="0"/>
+          <w:i w:val="0"/>
+          <w:strike w:val="0"/>
+        </w:rPr>
+        <w:t>"Again," Camilla said, and the headset man said "Closed," and the wall answered, and she didn't take her eyes off the stranger. "Six," Ben said.</w:t>
       </w:r>
     </w:p>
     <w:p>
@@ -750,7 +770,7 @@
           <w:i w:val="0"/>
           <w:strike w:val="0"/>
         </w:rPr>
-        <w:t>"I know what it is. I've sat behind those desks." She came two steps into the room. "Nobody's watching the ground tonight. Ashoka's standing in every doorway in the city, every guardian they've got, for the review. And Drona's got a wall that sees everything, and tonight it's turned the other way, at Meru. I watched them turn it." She said it level, a figure read off a sheet. "Whatever you're doing down there, nobody up there's going to look."</w:t>
+        <w:t>"I know what it is. I've sat behind those desks." She came two steps into the room. "Nobody's watching the ground tonight. Ashoka's standing in every doorway in the city, every guardian they've got, for the review. And Drona's wall is turned the other way tonight. I watched them turn it." She said it level, a figure read off a sheet. "Whatever you're doing down there, nobody up there's going to look."</w:t>
       </w:r>
     </w:p>
     <w:p>
@@ -820,6 +840,16 @@
           <w:i w:val="0"/>
           <w:strike w:val="0"/>
         </w:rPr>
+        <w:t>Elara had just said it aloud, to a stranger.</w:t>
+      </w:r>
+    </w:p>
+    <w:p>
+      <w:r>
+        <w:rPr>
+          <w:b w:val="0"/>
+          <w:i w:val="0"/>
+          <w:strike w:val="0"/>
+        </w:rPr>
         <w:t>The cups. The egg. The four dents in the grain. Someone had watched her learn every one.</w:t>
       </w:r>
     </w:p>
@@ -850,7 +880,7 @@
           <w:i w:val="0"/>
           <w:strike w:val="0"/>
         </w:rPr>
-        <w:t>"Landed," said Gage. "Again."</w:t>
+        <w:t>"Landed," said Gage.</w:t>
       </w:r>
     </w:p>
     <w:p>
@@ -910,17 +940,17 @@
           <w:i w:val="0"/>
           <w:strike w:val="0"/>
         </w:rPr>
-        <w:t>"You know when. You always know when." She looked at the sand. Less than half left in the top. "Nobody's looking. She says so."</w:t>
-      </w:r>
-    </w:p>
-    <w:p>
-      <w:r>
-        <w:rPr>
-          <w:b w:val="0"/>
-          <w:i w:val="0"/>
-          <w:strike w:val="0"/>
-        </w:rPr>
-        <w:t>Ben looked at Elara. Elara looked back at him. Something passed between them that Camilla didn't have time to read.</w:t>
+        <w:t>"You know when. You always know when." She looked at the sand. Less than half left in the top. "Otto's gone in, and that door opened by itself. Somebody has to be there when that door closes."</w:t>
+      </w:r>
+    </w:p>
+    <w:p>
+      <w:r>
+        <w:rPr>
+          <w:b w:val="0"/>
+          <w:i w:val="0"/>
+          <w:strike w:val="0"/>
+        </w:rPr>
+        <w:t>Ben looked at Elara. Elara nodded, once. Ben put two fingers to the earpiece.</w:t>
       </w:r>
     </w:p>
     <w:p>
@@ -1102,7 +1132,7 @@
           <w:i w:val="0"/>
           <w:strike w:val="0"/>
         </w:rPr>
-        <w:t xml:space="preserve">. He said </w:t>
+        <w:t xml:space="preserve">. Her voice said </w:t>
       </w:r>
       <w:r>
         <w:rPr>
@@ -1118,7 +1148,7 @@
           <w:i w:val="0"/>
           <w:strike w:val="0"/>
         </w:rPr>
-        <w:t>. He'd said them a hundred times over clay with Cami's voice answering, and her voice answered now, and that was all right. That held.</w:t>
+        <w:t>. He'd said it a hundred times over clay with Cami's voice answering, and it answered now, and that was all right. That held.</w:t>
       </w:r>
     </w:p>
     <w:p>
@@ -1154,7 +1184,7 @@
           <w:i w:val="0"/>
           <w:strike w:val="0"/>
         </w:rPr>
-        <w:t>Gage's hand stayed on the rock. He waited for the next word to be hers, and it wasn't, and the wall came in under his palm before he'd worked out what to do about that.</w:t>
+        <w:t>Gage's hand stayed on the rock. He waited for the next word to be hers, and it wasn't, and the eighth blow came in under his palm before he'd worked out what to do about that.</w:t>
       </w:r>
     </w:p>
     <w:p>
@@ -1212,15 +1242,31 @@
           <w:i/>
           <w:strike w:val="0"/>
         </w:rPr>
-        <w:t>Landed. Again.</w:t>
-      </w:r>
-      <w:r>
-        <w:rPr>
-          <w:b w:val="0"/>
-          <w:i w:val="0"/>
-          <w:strike w:val="0"/>
-        </w:rPr>
-        <w:t xml:space="preserve"> The blows came closer together, or seemed to, and the rock had started to say things back between them. A creak in the props behind him, long and low, a sound he'd heard once in two months and had run from. A patter of grit on the back of his neck. The needle wasn't settling between blows anymore. It lay over against its pin and shivered there.</w:t>
+        <w:t>Landed</w:t>
+      </w:r>
+      <w:r>
+        <w:rPr>
+          <w:b w:val="0"/>
+          <w:i w:val="0"/>
+          <w:strike w:val="0"/>
+        </w:rPr>
+        <w:t xml:space="preserve">, and Ben's </w:t>
+      </w:r>
+      <w:r>
+        <w:rPr>
+          <w:b w:val="0"/>
+          <w:i/>
+          <w:strike w:val="0"/>
+        </w:rPr>
+        <w:t>again</w:t>
+      </w:r>
+      <w:r>
+        <w:rPr>
+          <w:b w:val="0"/>
+          <w:i w:val="0"/>
+          <w:strike w:val="0"/>
+        </w:rPr>
+        <w:t>. The blows came closer together, or seemed to, and the rock had started to say things back between them. A creak in the props behind him, long and low, a sound he'd heard once in two months and had run from. A patter of grit on the back of his neck. The needle wasn't settling between blows anymore. It lay over against its pin and shivered there.</w:t>
       </w:r>
     </w:p>
     <w:p>
@@ -1300,7 +1346,7 @@
           <w:i w:val="0"/>
           <w:strike w:val="0"/>
         </w:rPr>
-        <w:t>He felt it in his teeth. His ears went tight, then tighter, and popped, and the air in the tunnel pushed at his face from nowhere. The props groaned, all of them at once, a long chord. And the rock spoke before it broke, the way Pappy used to say it did, a dry crackle running away from the junction in both directions faster than he could follow it, the sound of ice on a bucket, of a knuckle cracking a mile long.</w:t>
+        <w:t>He felt it in his teeth. His ears went tight, then tighter, and popped, and the air in the tunnel pushed at his face from nowhere. The props groaned, all of them at once, a long chord. And the rock spoke before it broke, the way Pappy used to say it did, a dry crackle running away from the junction in both directions faster than he could follow it, the sound of a knuckle cracking a mile long.</w:t>
       </w:r>
     </w:p>
     <w:p>
@@ -1430,7 +1476,7 @@
           <w:i w:val="0"/>
           <w:strike w:val="0"/>
         </w:rPr>
-        <w:t>He saw it all through the gap over the sill, in the second before the water reached him. The Hub filling. The turbine floor going under, its lamps going out row by row, like a street being put to bed. The water running on down the fall, the way he'd drawn it with his finger lake to pods, faster than he'd drawn it, toward the silver and the pods and the end of the straw.</w:t>
+        <w:t>He saw it all through the gap over the sill, in the second before the water reached him. The Hub filling. The turbine floor going under, its lamps going out row by row. The water running on down the fall, the way he'd drawn it with his finger lake to pods, faster than he'd drawn it, toward the silver and the pods and the end of the straw.</w:t>
       </w:r>
     </w:p>
     <w:p>
@@ -1460,7 +1506,7 @@
           <w:i w:val="0"/>
           <w:strike w:val="0"/>
         </w:rPr>
-        <w:t>It hadn't been on the model. Nothing had been on the model but the clean line of his finger.</w:t>
+        <w:t>It hadn't been on the model.</w:t>
       </w:r>
     </w:p>
     <w:p>
@@ -1640,7 +1686,7 @@
           <w:i w:val="0"/>
           <w:strike w:val="0"/>
         </w:rPr>
-        <w:t xml:space="preserve">She'd held the other one for seventy-two hours and never heard him speak until a man in the dark said </w:t>
+        <w:t xml:space="preserve">She'd been responsible for Gage for seventy-two hours and never heard his voice. Tonight she'd heard a handful of words, and the last was </w:t>
       </w:r>
       <w:r>
         <w:rPr>
@@ -1648,22 +1694,6 @@
           <w:i/>
           <w:strike w:val="0"/>
         </w:rPr>
-        <w:t>landed</w:t>
-      </w:r>
-      <w:r>
-        <w:rPr>
-          <w:b w:val="0"/>
-          <w:i w:val="0"/>
-          <w:strike w:val="0"/>
-        </w:rPr>
-        <w:t xml:space="preserve">, and the last word she'd heard him say was </w:t>
-      </w:r>
-      <w:r>
-        <w:rPr>
-          <w:b w:val="0"/>
-          <w:i/>
-          <w:strike w:val="0"/>
-        </w:rPr>
         <w:t>through</w:t>
       </w:r>
       <w:r>
@@ -1773,6 +1803,16 @@
           <w:strike w:val="0"/>
         </w:rPr>
         <w:t>In the doorway at the back of the table room, in black, his coat buttoned to the throat and his right arm held a little out from his body, with his left hand at his chest over something in his coat, stood Daren.</w:t>
+      </w:r>
+    </w:p>
+    <w:p>
+      <w:r>
+        <w:rPr>
+          <w:b w:val="0"/>
+          <w:i w:val="0"/>
+          <w:strike w:val="0"/>
+        </w:rPr>
+        <w:t>A screen had him now. Whatever he'd been asking of the band to come this far unseen, he'd stopped asking.</w:t>
       </w:r>
     </w:p>
     <w:sectPr>

</xml_diff>

<commit_message>
Ch28 review round 3: the arm as Camilla's reason, Elara's route, the door's first opening, Gage's sightline, trims
Co-Authored-By: Claude Opus 5.5 <noreply@anthropic.com>
</commit_message>
<xml_diff>
--- a/claude-notes/manuscript-v2/28-feeds-merged.docx
+++ b/claude-notes/manuscript-v2/28-feeds-merged.docx
@@ -113,7 +113,7 @@
           <w:i w:val="0"/>
           <w:strike w:val="0"/>
         </w:rPr>
-        <w:t>"Eleven."</w:t>
+        <w:t>"Eleven," Ben said, for the seconds the board would be down.</w:t>
       </w:r>
     </w:p>
     <w:p>
@@ -153,7 +153,7 @@
           <w:i w:val="0"/>
           <w:strike w:val="0"/>
         </w:rPr>
-        <w:t>Then he counted the rest of them off. He did it in the voice he'd used for Nayan's columns, flat, in order, nothing added: the men off the turbine floor, the men up out of the silver galleries with the grey dust to their elbows, the two at the pods who were always last because one of them couldn't find his gloves. Into the cage. The gate pulled across. The cage going up out of the top of the screen, and the cable shaking after it.</w:t>
+        <w:t>Then he counted the rest of them off. He did it in his reading voice, flat, in order, nothing added: the men off the turbine floor, the men up out of the silver galleries with the grey dust to their elbows, the two at the pods who were always last because one of them couldn't find his gloves. Into the cage. The gate pulled across. The cage going up out of the top of the screen, and the cable shaking after it.</w:t>
       </w:r>
     </w:p>
     <w:p>
@@ -526,7 +526,7 @@
           <w:i w:val="0"/>
           <w:strike w:val="0"/>
         </w:rPr>
-        <w:t xml:space="preserve">It was one of the ring's, one of the hundred small grey eyes this place kept on its own corridors, and it had shown the same thing every night: a short curve of corridor behind the table room, a door at the end of it that nobody used, a lamp above the door that nobody lit. The route was on Flitzberg's plans as disused. She'd asked him once where it went. </w:t>
+        <w:t xml:space="preserve">It was one of the ring's, one of the hundred small grey eyes this place kept on its own corridors, and it had shown the same thing every night: a short curve of corridor behind the table room, a door at the end of it that nobody used, a lamp above the door that nobody lit. Once already tonight it had shown something else: the door opening for an old man in gold, who hadn't looked at the lens. The route was on Flitzberg's plans as disused. She'd asked him once where it went. </w:t>
       </w:r>
       <w:r>
         <w:rPr>
@@ -590,7 +590,7 @@
           <w:i w:val="0"/>
           <w:strike w:val="0"/>
         </w:rPr>
-        <w:t>The four Grandmasters sat at the round table in the room she'd never been in. Flitzberg sat among them, in his own face, his hands folded. And the Master of the Reserve sat with his rings laid out before him in their row and his hands bare on the wood, and he didn't look round. He didn't look at the door at the back of the table room, or at anything. He was looking at the rings. He'd been expecting it.</w:t>
+        <w:t>The four Grandmasters sat at the round table in the room she'd never been in. Flitzberg sat among them, in his own face, his hands folded. And the Master of the Reserve sat with his rings laid out before him in their row and his hands bare on the wood, and he didn't look round. He didn't look at the door at the back of the table room, or at anything. He was looking at the rings. His thumb went along the row and squared the last one to the edge of the wood.</w:t>
       </w:r>
     </w:p>
     <w:p>
@@ -710,7 +710,7 @@
           <w:i w:val="0"/>
           <w:strike w:val="0"/>
         </w:rPr>
-        <w:t>"Elara Nathan. Drona." The girl's eyes went along the rows and came back. The mine. The sand-glass. Ben on his stool with his lips moving. "They put me in a room upstairs to watch the table. I've watched that door open for weeks on paper. I know what's behind it." She looked at the bottom row again, longer. "You're doing something to the mine."</w:t>
+        <w:t>"Elara Nathan. Drona." The girl's eyes went along the rows and came back. The mine. The sand-glass. Ben on his stool with his lips moving. "They put me in a room upstairs to watch the table. The woman who brought me went to see to something and didn't come back. I followed the fans. I've watched that door open for weeks on paper. I know what's behind it." She looked at the bottom row again, longer. "You're doing something to the mine."</w:t>
       </w:r>
     </w:p>
     <w:p>
@@ -770,7 +770,7 @@
           <w:i w:val="0"/>
           <w:strike w:val="0"/>
         </w:rPr>
-        <w:t>"I know what it is. I've sat behind those desks." She came two steps into the room. "Nobody's watching the ground tonight. Ashoka's standing in every doorway in the city, every guardian they've got, for the review. And Drona's wall is turned the other way tonight. I watched them turn it." She said it level, a figure read off a sheet. "Whatever you're doing down there, nobody up there's going to look."</w:t>
+        <w:t>"I know what it is. I've sat behind those desks." She came two steps into the room. "Nobody's watching the ground tonight. Ashoka's standing in every doorway in the city, every guardian they've got, for the review. And Drona's wall is turned the other way tonight. I watched them turn it. Whatever you're doing down there, nobody up there's going to look."</w:t>
       </w:r>
     </w:p>
     <w:p>
@@ -840,16 +840,6 @@
           <w:i w:val="0"/>
           <w:strike w:val="0"/>
         </w:rPr>
-        <w:t>Elara had just said it aloud, to a stranger.</w:t>
-      </w:r>
-    </w:p>
-    <w:p>
-      <w:r>
-        <w:rPr>
-          <w:b w:val="0"/>
-          <w:i w:val="0"/>
-          <w:strike w:val="0"/>
-        </w:rPr>
         <w:t>The cups. The egg. The four dents in the grain. Someone had watched her learn every one.</w:t>
       </w:r>
     </w:p>
@@ -940,7 +930,7 @@
           <w:i w:val="0"/>
           <w:strike w:val="0"/>
         </w:rPr>
-        <w:t>"You know when. You always know when." She looked at the sand. Less than half left in the top. "Otto's gone in, and that door opened by itself. Somebody has to be there when that door closes."</w:t>
+        <w:t>"You know when. You always know when." She held up the metal hand. It had closed again on its own. "If this talks, it isn't talking in here. Not tonight." She looked at the sand. Less than half left in the top. "And Otto's gone in, and that door opened by itself."</w:t>
       </w:r>
     </w:p>
     <w:p>
@@ -1476,7 +1466,7 @@
           <w:i w:val="0"/>
           <w:strike w:val="0"/>
         </w:rPr>
-        <w:t>He saw it all through the gap over the sill, in the second before the water reached him. The Hub filling. The turbine floor going under, its lamps going out row by row. The water running on down the fall, the way he'd drawn it with his finger lake to pods, faster than he'd drawn it, toward the silver and the pods and the end of the straw.</w:t>
+        <w:t>He saw it through the gap over the sill, in the second before the water reached him. The Hub filling.</w:t>
       </w:r>
     </w:p>
     <w:p>
@@ -1686,7 +1676,7 @@
           <w:i w:val="0"/>
           <w:strike w:val="0"/>
         </w:rPr>
-        <w:t xml:space="preserve">She'd been responsible for Gage for seventy-two hours and never heard his voice. Tonight she'd heard a handful of words, and the last was </w:t>
+        <w:t xml:space="preserve">She'd been responsible for Gage for seventy-two hours. Tonight she'd heard a handful of his words, and the last was </w:t>
       </w:r>
       <w:r>
         <w:rPr>
@@ -1812,7 +1802,7 @@
           <w:i w:val="0"/>
           <w:strike w:val="0"/>
         </w:rPr>
-        <w:t>A screen had him now. Whatever he'd been asking of the band to come this far unseen, he'd stopped asking.</w:t>
+        <w:t>His right hand hung open. A screen had him now. Whatever he'd been asking of the band to come this far unseen, he'd stopped asking.</w:t>
       </w:r>
     </w:p>
     <w:sectPr>

</xml_diff>